<commit_message>
fob -> cif and cif -> fob changes based on condition.
</commit_message>
<xml_diff>
--- a/templates/CHA CI.docx
+++ b/templates/CHA CI.docx
@@ -1919,7 +1919,7 @@
                 <w:sz w:val="20"/>
                 <w:szCs w:val="20"/>
               </w:rPr>
-              <w:t>TOTAL {{ total_quantity }} CIF (USD)</w:t>
+              <w:t>{%tr if has_freight_or_insurance %}</w:t>
             </w:r>
           </w:p>
         </w:tc>
@@ -1954,7 +1954,157 @@
                 <w:sz w:val="20"/>
                 <w:szCs w:val="20"/>
               </w:rPr>
+              <w:t/>
+            </w:r>
+          </w:p>
+        </w:tc>
+      </w:tr>
+      <w:tr>
+        <w:trPr>
+          <w:trHeight w:val="256" w:hRule="atLeast"/>
+        </w:trPr>
+        <w:tc>
+          <w:tcPr>
+            <w:tcW w:w="8466" w:type="dxa"/>
+            <w:gridSpan w:val="10"/>
+            <w:tcBorders>
+              <w:top w:val="single" w:sz="4" w:space="0" w:color="000000"/>
+              <w:left w:val="single" w:sz="4" w:space="0" w:color="000000"/>
+              <w:bottom w:val="single" w:sz="4" w:space="0" w:color="000000"/>
+              <w:right w:val="single" w:sz="4" w:space="0" w:color="000000"/>
+            </w:tcBorders>
+            <w:vAlign w:val="center"/>
+          </w:tcPr>
+          <w:p>
+            <w:pPr>
+              <w:pStyle w:val="TableParagraph"/>
+              <w:spacing w:lineRule="exact" w:line="234" w:before="2" w:after="0"/>
+              <w:ind w:left="31" w:right="105"/>
+              <w:jc w:val="right"/>
+              <w:rPr>
+                <w:rFonts w:ascii="Arial" w:hAnsi="Arial"/>
+                <w:sz w:val="20"/>
+                <w:szCs w:val="20"/>
+              </w:rPr>
+            </w:pPr>
+            <w:r>
+              <w:rPr>
+                <w:rFonts w:cs="Arial" w:ascii="Arial" w:hAnsi="Arial"/>
+                <w:b/>
+                <w:sz w:val="20"/>
+                <w:szCs w:val="20"/>
+              </w:rPr>
+              <w:t>TOTAL {{ total_quantity }} CIF (USD)</w:t>
+            </w:r>
+          </w:p>
+        </w:tc>
+        <w:tc>
+          <w:tcPr>
+            <w:tcW w:w="1273" w:type="dxa"/>
+            <w:tcBorders>
+              <w:top w:val="single" w:sz="4" w:space="0" w:color="000000"/>
+              <w:left w:val="single" w:sz="4" w:space="0" w:color="000000"/>
+              <w:bottom w:val="single" w:sz="4" w:space="0" w:color="000000"/>
+              <w:right w:val="single" w:sz="4" w:space="0" w:color="000000"/>
+            </w:tcBorders>
+            <w:vAlign w:val="center"/>
+          </w:tcPr>
+          <w:p>
+            <w:pPr>
+              <w:pStyle w:val="TableParagraph"/>
+              <w:spacing w:lineRule="exact" w:line="234" w:before="2" w:after="0"/>
+              <w:ind w:right="106"/>
+              <w:jc w:val="right"/>
+              <w:rPr>
+                <w:rFonts w:ascii="Arial" w:hAnsi="Arial"/>
+                <w:sz w:val="20"/>
+                <w:szCs w:val="20"/>
+              </w:rPr>
+            </w:pPr>
+            <w:r>
+              <w:rPr>
+                <w:rFonts w:cs="Arial" w:ascii="Arial" w:hAnsi="Arial"/>
+                <w:b/>
+                <w:bCs/>
+                <w:sz w:val="20"/>
+                <w:szCs w:val="20"/>
+              </w:rPr>
               <w:t>${{ total_cif_usd }}</w:t>
+            </w:r>
+          </w:p>
+        </w:tc>
+      </w:tr>
+      <w:tr>
+        <w:trPr>
+          <w:trHeight w:val="256" w:hRule="atLeast"/>
+        </w:trPr>
+        <w:tc>
+          <w:tcPr>
+            <w:tcW w:w="8466" w:type="dxa"/>
+            <w:gridSpan w:val="10"/>
+            <w:tcBorders>
+              <w:top w:val="single" w:sz="4" w:space="0" w:color="000000"/>
+              <w:left w:val="single" w:sz="4" w:space="0" w:color="000000"/>
+              <w:bottom w:val="single" w:sz="4" w:space="0" w:color="000000"/>
+              <w:right w:val="single" w:sz="4" w:space="0" w:color="000000"/>
+            </w:tcBorders>
+            <w:vAlign w:val="center"/>
+          </w:tcPr>
+          <w:p>
+            <w:pPr>
+              <w:pStyle w:val="TableParagraph"/>
+              <w:spacing w:lineRule="exact" w:line="234" w:before="2" w:after="0"/>
+              <w:ind w:left="31" w:right="105"/>
+              <w:jc w:val="right"/>
+              <w:rPr>
+                <w:rFonts w:ascii="Arial" w:hAnsi="Arial"/>
+                <w:sz w:val="20"/>
+                <w:szCs w:val="20"/>
+              </w:rPr>
+            </w:pPr>
+            <w:r>
+              <w:rPr>
+                <w:rFonts w:cs="Arial" w:ascii="Arial" w:hAnsi="Arial"/>
+                <w:b/>
+                <w:sz w:val="20"/>
+                <w:szCs w:val="20"/>
+              </w:rPr>
+              <w:t>{%tr endif %}</w:t>
+            </w:r>
+          </w:p>
+        </w:tc>
+        <w:tc>
+          <w:tcPr>
+            <w:tcW w:w="1273" w:type="dxa"/>
+            <w:tcBorders>
+              <w:top w:val="single" w:sz="4" w:space="0" w:color="000000"/>
+              <w:left w:val="single" w:sz="4" w:space="0" w:color="000000"/>
+              <w:bottom w:val="single" w:sz="4" w:space="0" w:color="000000"/>
+              <w:right w:val="single" w:sz="4" w:space="0" w:color="000000"/>
+            </w:tcBorders>
+            <w:vAlign w:val="center"/>
+          </w:tcPr>
+          <w:p>
+            <w:pPr>
+              <w:pStyle w:val="TableParagraph"/>
+              <w:spacing w:lineRule="exact" w:line="234" w:before="2" w:after="0"/>
+              <w:ind w:right="106"/>
+              <w:jc w:val="right"/>
+              <w:rPr>
+                <w:rFonts w:ascii="Arial" w:hAnsi="Arial"/>
+                <w:sz w:val="20"/>
+                <w:szCs w:val="20"/>
+              </w:rPr>
+            </w:pPr>
+            <w:r>
+              <w:rPr>
+                <w:rFonts w:cs="Arial" w:ascii="Arial" w:hAnsi="Arial"/>
+                <w:b/>
+                <w:bCs/>
+                <w:sz w:val="20"/>
+                <w:szCs w:val="20"/>
+              </w:rPr>
+              <w:t/>
             </w:r>
           </w:p>
         </w:tc>

</xml_diff>